<commit_message>
human_m sprites visual redesign initial commit
</commit_message>
<xml_diff>
--- a/documentation/docs/Graphics Plan.docx
+++ b/documentation/docs/Graphics Plan.docx
@@ -34,6 +34,7 @@
       <w:r>
         <w:t xml:space="preserve">1. </w:t>
       </w:r>
+      <w:proofErr w:type="spellStart"/>
       <w:r>
         <w:t>PlantEn</w:t>
       </w:r>
@@ -43,6 +44,7 @@
       <w:r>
         <w:t>ity</w:t>
       </w:r>
+      <w:proofErr w:type="spellEnd"/>
       <w:r>
         <w:t>:</w:t>
       </w:r>
@@ -60,9 +62,11 @@
       <w:r>
         <w:t xml:space="preserve">2. </w:t>
       </w:r>
+      <w:proofErr w:type="spellStart"/>
       <w:r>
         <w:t>AnimalMobEntity</w:t>
       </w:r>
+      <w:proofErr w:type="spellEnd"/>
       <w:r>
         <w:t>:</w:t>
       </w:r>
@@ -106,7 +110,15 @@
         <w:t>2.</w:t>
       </w:r>
       <w:r>
-        <w:t>5. Karchari dog</w:t>
+        <w:t xml:space="preserve">5. </w:t>
+      </w:r>
+      <w:proofErr w:type="spellStart"/>
+      <w:r>
+        <w:t>Karchari</w:t>
+      </w:r>
+      <w:proofErr w:type="spellEnd"/>
+      <w:r>
+        <w:t xml:space="preserve"> dog</w:t>
       </w:r>
     </w:p>
     <w:p>
@@ -114,7 +126,15 @@
         <w:t>2.</w:t>
       </w:r>
       <w:r>
-        <w:t>6. Bersekari bear</w:t>
+        <w:t xml:space="preserve">6. </w:t>
+      </w:r>
+      <w:proofErr w:type="spellStart"/>
+      <w:r>
+        <w:t>Bersekari</w:t>
+      </w:r>
+      <w:proofErr w:type="spellEnd"/>
+      <w:r>
+        <w:t xml:space="preserve"> bear</w:t>
       </w:r>
     </w:p>
     <w:p>
@@ -146,37 +166,46 @@
         <w:t>2.</w:t>
       </w:r>
       <w:r>
-        <w:t>10. Snake karchari</w:t>
-      </w:r>
+        <w:t xml:space="preserve">10. Snake </w:t>
+      </w:r>
+      <w:proofErr w:type="spellStart"/>
+      <w:r>
+        <w:t>karchari</w:t>
+      </w:r>
+      <w:proofErr w:type="spellEnd"/>
     </w:p>
     <w:p>
       <w:r>
         <w:t>2.</w:t>
       </w:r>
       <w:r>
-        <w:t>11. Royal vivern</w:t>
-      </w:r>
-    </w:p>
-    <w:p>
-      <w:r>
-        <w:t>12. Sandstone wyrm</w:t>
-      </w:r>
+        <w:t xml:space="preserve">11. Royal </w:t>
+      </w:r>
+      <w:proofErr w:type="spellStart"/>
+      <w:r>
+        <w:t>vivern</w:t>
+      </w:r>
+      <w:proofErr w:type="spellEnd"/>
+    </w:p>
+    <w:p>
+      <w:r>
+        <w:t xml:space="preserve">12. Sandstone </w:t>
+      </w:r>
+      <w:proofErr w:type="spellStart"/>
+      <w:r>
+        <w:t>wyrm</w:t>
+      </w:r>
+      <w:proofErr w:type="spellEnd"/>
     </w:p>
     <w:p/>
     <w:p>
       <w:r>
-        <w:t>3. Tile</w:t>
-      </w:r>
-      <w:r>
-        <w:t>s</w:t>
-      </w:r>
-    </w:p>
-    <w:p>
-      <w:r>
-        <w:t xml:space="preserve">3.1. </w:t>
-      </w:r>
-      <w:r>
-        <w:t>Liquid tile</w:t>
+        <w:t>3. Tiles</w:t>
+      </w:r>
+    </w:p>
+    <w:p>
+      <w:r>
+        <w:t>3.1. Liquid tile</w:t>
       </w:r>
     </w:p>
     <w:p>
@@ -224,6 +253,17 @@
       <w:r>
         <w:t xml:space="preserve"> m</w:t>
       </w:r>
+      <w:r>
+        <w:t xml:space="preserve"> </w:t>
+      </w:r>
+      <w:hyperlink r:id="rId5" w:history="1">
+        <w:r>
+          <w:rPr>
+            <w:rStyle w:val="Hyperlink"/>
+          </w:rPr>
+          <w:t>https://www.google.com/search?sca_esv=81b9b8c5170cc920&amp;rlz=1C1CHBF_enHR1112HR1112&amp;sxsrf=AE3TifNKakiroJB_sppTdNwsK_P9A53HJg:1761662148530&amp;udm=2&amp;fbs=AIIjpHxU7SXXniUZfeShr2fp4giZ1Y6MJ25_tmWITc7uy4KIemkjk18Cn72Gp24fGkjjh6wQFVCbKXb4P6swJy4x5wjmC_909EqiJuKoJVBAt1bQqxuAxTVm5FaXw1YXOj1toa8ncfxNzh8ymSC6erNMQMd3J8Ncs7DFjZ2Fw-WTZE5QJfNJhhWGF3qsB5rSAkjoZagT3x60&amp;q=human+body+pixel+art&amp;sa=X&amp;sqi=2&amp;ved=2ahUKEwis-s70jseQAxVMAtsEHeuRJ44QtKgLegQIGxAB&amp;biw=2560&amp;bih=1313&amp;dpr=1#vhid=Q9qHOsmMOGE0DM&amp;vssid=mosaic</w:t>
+        </w:r>
+      </w:hyperlink>
     </w:p>
     <w:p>
       <w:r>
@@ -232,12 +272,28 @@
     </w:p>
     <w:p>
       <w:r>
-        <w:t>1.3. Drethar m</w:t>
-      </w:r>
-    </w:p>
-    <w:p>
-      <w:r>
-        <w:t>1.4. Drethar f</w:t>
+        <w:t xml:space="preserve">1.3. </w:t>
+      </w:r>
+      <w:proofErr w:type="spellStart"/>
+      <w:r>
+        <w:t>Drethar</w:t>
+      </w:r>
+      <w:proofErr w:type="spellEnd"/>
+      <w:r>
+        <w:t xml:space="preserve"> m</w:t>
+      </w:r>
+    </w:p>
+    <w:p>
+      <w:r>
+        <w:t xml:space="preserve">1.4. </w:t>
+      </w:r>
+      <w:proofErr w:type="spellStart"/>
+      <w:r>
+        <w:t>Drethar</w:t>
+      </w:r>
+      <w:proofErr w:type="spellEnd"/>
+      <w:r>
+        <w:t xml:space="preserve"> f</w:t>
       </w:r>
       <w:r>
         <w:br/>
@@ -255,59 +311,36 @@
       </w:r>
       <w:r>
         <w:br/>
-        <w:t xml:space="preserve">2. </w:t>
-      </w:r>
-      <w:r>
-        <w:t>Armors:</w:t>
+        <w:t>2. Armors:</w:t>
       </w:r>
       <w:r>
         <w:br/>
-      </w:r>
-      <w:r>
-        <w:t>2.</w:t>
-      </w:r>
-      <w:r>
-        <w:t>1. Nomadic villager m/f</w:t>
-      </w:r>
-    </w:p>
-    <w:p>
-      <w:r>
-        <w:t>2.</w:t>
-      </w:r>
-      <w:r>
-        <w:t>2. Nomadic miner m/f</w:t>
-      </w:r>
-    </w:p>
-    <w:p>
-      <w:r>
-        <w:t>2.</w:t>
-      </w:r>
-      <w:r>
-        <w:t>3. Nomadic trader m/f</w:t>
-      </w:r>
-    </w:p>
-    <w:p>
-      <w:r>
-        <w:t>2.</w:t>
-      </w:r>
-      <w:r>
-        <w:t>4. Nomadic caravanner m/f</w:t>
-      </w:r>
-    </w:p>
-    <w:p>
-      <w:r>
-        <w:t>2.</w:t>
-      </w:r>
-      <w:r>
-        <w:t>5. Nomadic town lead m/f</w:t>
-      </w:r>
-    </w:p>
-    <w:p>
-      <w:r>
-        <w:t>2.</w:t>
-      </w:r>
-      <w:r>
-        <w:t>6. Nomadic city guard m/f</w:t>
+        <w:t>2.1. Nomadic villager m/f</w:t>
+      </w:r>
+    </w:p>
+    <w:p>
+      <w:r>
+        <w:t>2.2. Nomadic miner m/f</w:t>
+      </w:r>
+    </w:p>
+    <w:p>
+      <w:r>
+        <w:t>2.3. Nomadic trader m/f</w:t>
+      </w:r>
+    </w:p>
+    <w:p>
+      <w:r>
+        <w:t>2.4. Nomadic caravanner m/f</w:t>
+      </w:r>
+    </w:p>
+    <w:p>
+      <w:r>
+        <w:t>2.5. Nomadic town lead m/f</w:t>
+      </w:r>
+    </w:p>
+    <w:p>
+      <w:r>
+        <w:t>2.6. Nomadic city guard m/f</w:t>
       </w:r>
     </w:p>
     <w:p/>
@@ -347,6 +380,7 @@
     </w:p>
     <w:p>
       <w:r>
+        <w:lastRenderedPageBreak/>
         <w:t>3.6. Oasis</w:t>
       </w:r>
     </w:p>
@@ -372,7 +406,6 @@
     </w:p>
     <w:p>
       <w:r>
-        <w:lastRenderedPageBreak/>
         <w:t>3.11. Ash</w:t>
       </w:r>
     </w:p>
@@ -384,10 +417,7 @@
         <w:t>2</w:t>
       </w:r>
       <w:r>
-        <w:t xml:space="preserve">. </w:t>
-      </w:r>
-      <w:r>
-        <w:t>Water regular</w:t>
+        <w:t>. Water regular</w:t>
       </w:r>
     </w:p>
     <w:p>
@@ -1130,6 +1160,29 @@
       <w:contextualSpacing/>
     </w:pPr>
   </w:style>
+  <w:style w:type="character" w:styleId="Hyperlink">
+    <w:name w:val="Hyperlink"/>
+    <w:basedOn w:val="DefaultParagraphFont"/>
+    <w:uiPriority w:val="99"/>
+    <w:unhideWhenUsed/>
+    <w:rsid w:val="001634E4"/>
+    <w:rPr>
+      <w:color w:val="0563C1" w:themeColor="hyperlink"/>
+      <w:u w:val="single"/>
+    </w:rPr>
+  </w:style>
+  <w:style w:type="character" w:styleId="UnresolvedMention">
+    <w:name w:val="Unresolved Mention"/>
+    <w:basedOn w:val="DefaultParagraphFont"/>
+    <w:uiPriority w:val="99"/>
+    <w:semiHidden/>
+    <w:unhideWhenUsed/>
+    <w:rsid w:val="001634E4"/>
+    <w:rPr>
+      <w:color w:val="605E5C"/>
+      <w:shd w:val="clear" w:color="auto" w:fill="E1DFDD"/>
+    </w:rPr>
+  </w:style>
 </w:styles>
 </file>
 

</xml_diff>